<commit_message>
Decision 034: second research paper added — Compute, Credit & Couches
Research launches with two papers.

Co-Authored-By: Claude Fable 5 <noreply@anthropic.com>
</commit_message>
<xml_diff>
--- a/docs/source/furniture-retail-research.docx
+++ b/docs/source/furniture-retail-research.docx
@@ -37,7 +37,7 @@
           <w:color w:val="646464"/>
           <w:sz w:val="18"/>
         </w:rPr>
-        <w:t>Research-expanded advertorial / blog draft  |  August 2026</w:t>
+        <w:t>August 2026</w:t>
       </w:r>
     </w:p>
     <w:tbl>
@@ -2343,13 +2343,28 @@
                 <w:sz w:val="20"/>
               </w:rPr>
               <w:lastRenderedPageBreak/>
-              <w:t xml:space="preserve">Publication note:  </w:t>
+              <w:t xml:space="preserve">Publication </w:t>
+            </w:r>
+            <w:proofErr w:type="gramStart"/>
+            <w:r>
+              <w:rPr>
+                <w:b/>
+                <w:sz w:val="20"/>
+              </w:rPr>
+              <w:t xml:space="preserve">note:  </w:t>
             </w:r>
             <w:r>
               <w:rPr>
                 <w:sz w:val="20"/>
               </w:rPr>
-              <w:t>This draft is structured as an advertorial / industry perspective. Program-specific FurnitureRx and RAP claims are presented as company program representations; third-party market claims are identified in the research source list.</w:t>
+              <w:t>Program</w:t>
+            </w:r>
+            <w:proofErr w:type="gramEnd"/>
+            <w:r>
+              <w:rPr>
+                <w:sz w:val="20"/>
+              </w:rPr>
+              <w:t>-specific FurnitureRx and RAP claims are presented as company program representations; third-party market claims are identified in the research source list.</w:t>
             </w:r>
           </w:p>
         </w:tc>

</xml_diff>